<commit_message>
Fill in real author/team names across all documents
Author list (Ruchikesha S, Suhil Prasanth S, Tara C, Pavani V Reddy,
R Sai Pranav) taken from the team's IEEE paper draft. Also fixes
docx_build.py's author-paragraph detection, which matched the old
[Author N] placeholder literally and broke once real names were filled in.
</commit_message>
<xml_diff>
--- a/ForgeGuard_IEEE_Paper.docx
+++ b/ForgeGuard_IEEE_Paper.docx
@@ -48,7 +48,7 @@
                 <w:rFonts w:ascii="Times New Roman" w:hAnsi="Times New Roman"/>
                 <w:sz w:val="21"/>
               </w:rPr>
-              <w:t>[Author 1]</w:t>
+              <w:t>Ruchikesha S</w:t>
             </w:r>
           </w:p>
           <w:p>
@@ -98,7 +98,7 @@
                 <w:rFonts w:ascii="Times New Roman" w:hAnsi="Times New Roman"/>
                 <w:sz w:val="21"/>
               </w:rPr>
-              <w:t>[Author 2]</w:t>
+              <w:t>Suhil Prasanth S</w:t>
             </w:r>
           </w:p>
           <w:p>
@@ -150,7 +150,7 @@
                 <w:rFonts w:ascii="Times New Roman" w:hAnsi="Times New Roman"/>
                 <w:sz w:val="21"/>
               </w:rPr>
-              <w:t>[Author 3]</w:t>
+              <w:t>Tara C</w:t>
             </w:r>
           </w:p>
           <w:p>
@@ -200,7 +200,7 @@
                 <w:rFonts w:ascii="Times New Roman" w:hAnsi="Times New Roman"/>
                 <w:sz w:val="21"/>
               </w:rPr>
-              <w:t>[Author 4]</w:t>
+              <w:t>Pavani V Reddy</w:t>
             </w:r>
           </w:p>
           <w:p>
@@ -229,6 +229,64 @@
               <w:t>REVA University, Yelahanka, Bengaluru, India</w:t>
             </w:r>
           </w:p>
+        </w:tc>
+      </w:tr>
+      <w:tr>
+        <w:tc>
+          <w:tcPr>
+            <w:tcW w:type="dxa" w:w="5227"/>
+          </w:tcPr>
+          <w:p>
+            <w:pPr>
+              <w:spacing w:before="80" w:after="0" w:line="240" w:lineRule="auto"/>
+              <w:jc w:val="center"/>
+            </w:pPr>
+            <w:r>
+              <w:rPr>
+                <w:rFonts w:ascii="Times New Roman" w:hAnsi="Times New Roman"/>
+                <w:sz w:val="21"/>
+              </w:rPr>
+            </w:r>
+            <w:r>
+              <w:rPr>
+                <w:rFonts w:ascii="Times New Roman" w:hAnsi="Times New Roman"/>
+                <w:sz w:val="21"/>
+              </w:rPr>
+              <w:t>R Sai Pranav</w:t>
+            </w:r>
+          </w:p>
+          <w:p>
+            <w:pPr>
+              <w:spacing w:before="0" w:after="0" w:line="240" w:lineRule="auto"/>
+              <w:jc w:val="center"/>
+            </w:pPr>
+            <w:r>
+              <w:rPr>
+                <w:rFonts w:ascii="Times New Roman" w:hAnsi="Times New Roman"/>
+                <w:sz w:val="18"/>
+              </w:rPr>
+              <w:t>School of Computer Science &amp; Engineering</w:t>
+            </w:r>
+          </w:p>
+          <w:p>
+            <w:pPr>
+              <w:spacing w:before="0" w:after="0" w:line="240" w:lineRule="auto"/>
+              <w:jc w:val="center"/>
+            </w:pPr>
+            <w:r>
+              <w:rPr>
+                <w:rFonts w:ascii="Times New Roman" w:hAnsi="Times New Roman"/>
+                <w:sz w:val="18"/>
+              </w:rPr>
+              <w:t>REVA University, Yelahanka, Bengaluru, India</w:t>
+            </w:r>
+          </w:p>
+        </w:tc>
+        <w:tc>
+          <w:tcPr>
+            <w:tcW w:type="dxa" w:w="5227"/>
+          </w:tcPr>
+          <w:p/>
         </w:tc>
       </w:tr>
     </w:tbl>

</xml_diff>